<commit_message>
docs: update panduan fundamental fullstack SIMMACI
</commit_message>
<xml_diff>
--- a/PANDUAN_FUNDAMENTAL_FULLSTACK_SIMMACI.docx
+++ b/PANDUAN_FUNDAMENTAL_FULLSTACK_SIMMACI.docx
@@ -1,52 +1,6 @@
 
 <file path=word/document.xml><?xml version="1.0" encoding="UTF-8" standalone="yes"?>
-<w:document xmlns:ve="http://schemas.openxmlformats.org/markup-compatibility/2006" xmlns:o="urn:schemas-microsoft-com:office:office" xmlns:r="http://schemas.openxmlformats.org/officeDocument/2006/relationships" xmlns:m="http://schemas.openxmlformats.org/officeDocument/2006/math" xmlns:v="urn:schemas-microsoft-com:vml" xmlns:wp="http://schemas.openxmlformats.org/drawingml/2006/wordprocessingDrawing" xmlns:w10="urn:schemas-microsoft-com:office:word" xmlns:w="http://schemas.openxmlformats.org/wordprocessingml/2006/main" xmlns:wne="http://schemas.microsoft.com/office/word/2006/wordml"><w:body><w:p><w:pPr><w:jc w:val="center"/></w:pPr><w:r><w:rPr><w:color w:val="047857"/><w:sz w:val="20"/><w:szCs w:val="20"/><w:b w:val="1"/><w:bCs w:val="1"/></w:rPr><w:t xml:space="preserve">MODUL BINAAN & CHEATSHEET RESMI</w:t></w:r></w:p><w:p/><w:p><w:pPr><w:jc w:val="center"/></w:pPr><w:r><w:rPr><w:color w:val="064E3B"/><w:sz w:val="44"/><w:szCs w:val="44"/><w:b w:val="1"/><w:bCs w:val="1"/></w:rPr><w:t xml:space="preserve">PANDUAN FUNDAMENTAL FULLSTACK DEVELOPER</w:t></w:r></w:p><w:p><w:pPr><w:jc w:val="center"/></w:pPr><w:r><w:rPr><w:color w:val="475569"/><w:sz w:val="24"/><w:szCs w:val="24"/><w:i w:val="1"/><w:iCs w:val="1"/></w:rPr><w:t xml:space="preserve">Membangun Pemahaman Arsitektur Software Modern dari Nol Berdasarkan Studi Kasus Nyata Aplikasi SIMMACI</w:t></w:r></w:p><w:p/><w:p/><w:p><w:pPr><w:jc w:val="center"/></w:pPr><w:r><w:rPr><w:b w:val="1"/><w:bCs w:val="1"/></w:rPr><w:t xml:space="preserve">Disusun Khusus Untuk: Pengembangan Diri & Penguasaan Arsitektur SIMMACI</w:t></w:r></w:p><w:p><w:pPr><w:jc w:val="center"/></w:pPr><w:r><w:rPr/><w:t xml:space="preserve">Studi Kasus: React 19 + TypeScript + Laravel 12 + PostgreSQL</w:t></w:r></w:p><w:p><w:pPr><w:jc w:val="center"/></w:pPr><w:r><w:rPr/><w:t xml:space="preserve">Tingkat: Pemula Tanpa Dasar Coding (Konseptual hingga Praktikal)</w:t></w:r></w:p><w:p><w:pPr><w:jc w:val="center"/></w:pPr><w:r><w:rPr/><w:t xml:space="preserve">Tahun Terbit: September 2026</w:t></w:r></w:p><w:p><w:r><w:br w:type="page"/></w:r></w:p><w:p><w:pPr><w:pStyle w:val="Heading1"/></w:pPr><w:bookmarkStart w:id="0" w:name="_Toc0"/><w:r><w:t>BAB 1: Peta Besar Fullstack (Analogi Restoran)</w:t></w:r><w:bookmarkEnd w:id="0"/></w:p><w:p><w:pPr/><w:r><w:rPr/><w:t xml:space="preserve">Banyak pemula merasa terintimidasi oleh coding karena menganggap software adalah mantra misterius. Sebenarnya, seluruh aplikasi website modern di dunia (dari Facebook, Tokopedia, hingga SIMMACI) bekerja persis seperti sebuah Restoran yang melayani pelanggan.</w:t></w:r></w:p><w:p/><w:p><w:pPr><w:pStyle w:val="Heading2"/></w:pPr><w:bookmarkStart w:id="1" w:name="_Toc1"/><w:r><w:t>4 Pilar Utama Arsitektur Fullstack:</w:t></w:r><w:bookmarkEnd w:id="1"/></w:p><w:p><w:pPr><w:numPr><w:ilvl w:val="0"/><w:numId w:val="4"/></w:numPr></w:pPr><w:r><w:rPr/><w:t xml:space="preserve">Frontend (Meja Pelanggan): Tampilan yang dilihat dan disentuh pengguna di browser (React & Tailwind CSS).</w:t></w:r></w:p><w:p><w:pPr><w:numPr><w:ilvl w:val="0"/><w:numId w:val="4"/></w:numPr></w:pPr><w:r><w:rPr/><w:t xml:space="preserve">API / Internet (Pelayan Restoran): Kurir pengantar paket data bolak-balik dalam format standar JSON via protokol HTTP.</w:t></w:r></w:p><w:p><w:pPr><w:numPr><w:ilvl w:val="0"/><w:numId w:val="4"/></w:numPr></w:pPr><w:r><w:rPr/><w:t xml:space="preserve">Backend (Dapur & Koki): Komputer server aman yang memvalidasi data, mengecek otorisasi, dan memproses logika (Laravel PHP).</w:t></w:r></w:p><w:p><w:pPr><w:numPr><w:ilvl w:val="0"/><w:numId w:val="4"/></w:numPr></w:pPr><w:r><w:rPr/><w:t xml:space="preserve">Database (Gudang & Kulkas Bahan): Harddisk penyimpanan data terstruktur permanen (PostgreSQL / MySQL).</w:t></w:r></w:p><w:p><w:pPr><w:pStyle w:val="Heading2"/></w:pPr><w:bookmarkStart w:id="2" w:name="_Toc2"/><w:r><w:t>Siklus 7 Langkah Permintaan Data (End-to-End Request Lifecycle):</w:t></w:r><w:bookmarkEnd w:id="2"/></w:p><w:p><w:pPr><w:numPr><w:ilvl w:val="0"/><w:numId w:val="4"/></w:numPr></w:pPr><w:r><w:rPr/><w:t xml:space="preserve">1. User Trigger (Frontend): Pengguna mengklik tombol Simpan di browser.</w:t></w:r></w:p><w:p><w:pPr><w:numPr><w:ilvl w:val="0"/><w:numId w:val="4"/></w:numPr></w:pPr><w:r><w:rPr/><w:t xml:space="preserve">2. Mengirim Paket (API Request): Data dikemas ke format JSON dan dikirim via HTTP POST.</w:t></w:r></w:p><w:p><w:pPr><w:numPr><w:ilvl w:val="0"/><w:numId w:val="4"/></w:numPr></w:pPr><w:r><w:rPr/><w:t xml:space="preserve">3. Resepsionis Gerbang (Routing): Laravel mengarahkan paket ke Controller yang tepat.</w:t></w:r></w:p><w:p><w:pPr><w:numPr><w:ilvl w:val="0"/><w:numId w:val="4"/></w:numPr></w:pPr><w:r><w:rPr/><w:t xml:space="preserve">4. Validasi & Keamanan: Koki memeriksa apakah data lengkap dan pengguna memiliki izin.</w:t></w:r></w:p><w:p><w:pPr><w:numPr><w:ilvl w:val="0"/><w:numId w:val="4"/></w:numPr></w:pPr><w:r><w:rPr/><w:t xml:space="preserve">5. Menyimpan ke Gudang (Database Query): Data disimpan permanen ke database melalui Eloquent Model.</w:t></w:r></w:p><w:p><w:pPr><w:numPr><w:ilvl w:val="0"/><w:numId w:val="4"/></w:numPr></w:pPr><w:r><w:rPr/><w:t xml:space="preserve">6. Mengirim Balasan (API Response): Server mengembalikan respon status { "success": true }.</w:t></w:r></w:p><w:p><w:pPr><w:numPr><w:ilvl w:val="0"/><w:numId w:val="4"/></w:numPr></w:pPr><w:r><w:rPr/><w:t xml:space="preserve">7. Umpan Balik Layar (Reactivity): Browser memunculkan notifikasi Toast dan memperbarui layar seketika.</w:t></w:r></w:p><w:p><w:r><w:br w:type="page"/></w:r></w:p><w:p><w:pPr><w:pStyle w:val="Heading1"/></w:pPr><w:bookmarkStart w:id="3" w:name="_Toc3"/><w:r><w:t>BAB 2: Anatomi Bahasa Coding (Baku vs Bebas)</w:t></w:r><w:bookmarkEnd w:id="3"/></w:p><w:p><w:pPr/><w:r><w:rPr/><w:t xml:space="preserve">Bahasa coding sangat baku dan ketat pada tata bahasanya (sintaks), namun bebas pada penamaan variabel dan logikanya.</w:t></w:r></w:p><w:p><w:pPr/><w:r><w:rPr/><w:t xml:space="preserve">Komputer tidak memiliki akal sehat. Jika Anda salah mengetik satu huruf saja (misal: retrun alih-alih return), komputer akan langsung berhenti dan memunculkan pesan Syntax Error.</w:t></w:r></w:p><w:p/><w:tbl><w:tblGrid><w:gridCol w:w="3000" w:type="dxa"/><w:gridCol w:w="3500" w:type="dxa"/><w:gridCol w:w="3500" w:type="dxa"/></w:tblGrid><w:tblPr><w:tblStyle w:val="TableBakuBebas"/></w:tblPr><w:tr><w:trPr/><w:tc><w:tcPr><w:tcW w:w="3000" w:type="dxa"/><w:shd w:val="clear" w:fill="065F46"/><w:noWrap/></w:tcPr><w:p><w:pPr/><w:r><w:rPr><w:color w:val="FFFFFF"/><w:b w:val="1"/><w:bCs w:val="1"/></w:rPr><w:t xml:space="preserve">Kategori</w:t></w:r></w:p></w:tc><w:tc><w:tcPr><w:tcW w:w="3500" w:type="dxa"/><w:shd w:val="clear" w:fill="065F46"/><w:noWrap/></w:tcPr><w:p><w:pPr/><w:r><w:rPr><w:color w:val="FFFFFF"/><w:b w:val="1"/><w:bCs w:val="1"/></w:rPr><w:t xml:space="preserve">Contoh di SIMMACI</w:t></w:r></w:p></w:tc><w:tc><w:tcPr><w:tcW w:w="3500" w:type="dxa"/><w:shd w:val="clear" w:fill="065F46"/><w:noWrap/></w:tcPr><w:p><w:pPr/><w:r><w:rPr><w:color w:val="FFFFFF"/><w:b w:val="1"/><w:bCs w:val="1"/></w:rPr><w:t xml:space="preserve">Aturan Pemakaian</w:t></w:r></w:p></w:tc></w:tr><w:tr><w:trPr/><w:tc><w:tcPr><w:tcW w:w="3000" w:type="dxa"/><w:noWrap/></w:tcPr><w:p><w:pPr/><w:r><w:rPr><w:b w:val="1"/><w:bCs w:val="1"/></w:rPr><w:t xml:space="preserve">Kata Kunci Baku (Keywords)</w:t></w:r></w:p></w:tc><w:tc><w:tcPr><w:tcW w:w="3500" w:type="dxa"/><w:noWrap/></w:tcPr><w:p><w:pPr/><w:r><w:rPr/><w:t xml:space="preserve">public, function, if, return, try, catch</w:t></w:r></w:p></w:tc><w:tc><w:tcPr><w:tcW w:w="3500" w:type="dxa"/><w:noWrap/></w:tcPr><w:p><w:pPr/><w:r><w:rPr/><w:t xml:space="preserve">Bawaan resmi bahasa pemrograman. Tidak boleh diganti satu huruf pun.</w:t></w:r></w:p></w:tc></w:tr><w:tr><w:trPr/><w:tc><w:tcPr><w:tcW w:w="3000" w:type="dxa"/><w:shd w:val="clear" w:fill="F8FAFC"/><w:noWrap/></w:tcPr><w:p><w:pPr/><w:r><w:rPr><w:b w:val="1"/><w:bCs w:val="1"/></w:rPr><w:t xml:space="preserve">Tanda Baca Baku (Syntax)</w:t></w:r></w:p></w:tc><w:tc><w:tcPr><w:tcW w:w="3500" w:type="dxa"/><w:shd w:val="clear" w:fill="F8FAFC"/><w:noWrap/></w:tcPr><w:p><w:pPr/><w:r><w:rPr/><w:t xml:space="preserve">(), {}, ;, -></w:t></w:r></w:p></w:tc><w:tc><w:tcPr><w:tcW w:w="3500" w:type="dxa"/><w:shd w:val="clear" w:fill="F8FAFC"/><w:noWrap/></w:tcPr><w:p><w:pPr/><w:r><w:rPr/><w:t xml:space="preserve">Pembuka dan penutup instruksi wajib.</w:t></w:r></w:p></w:tc></w:tr><w:tr><w:trPr/><w:tc><w:tcPr><w:tcW w:w="3000" w:type="dxa"/><w:noWrap/></w:tcPr><w:p><w:pPr/><w:r><w:rPr><w:b w:val="1"/><w:bCs w:val="1"/></w:rPr><w:t xml:space="preserve">Nama Variabel (Bebas)</w:t></w:r></w:p></w:tc><w:tc><w:tcPr><w:tcW w:w="3500" w:type="dxa"/><w:noWrap/></w:tcPr><w:p><w:pPr/><w:r><w:rPr/><w:t xml:space="preserve">$user, $schoolId, $namaGuru</w:t></w:r></w:p></w:tc><w:tc><w:tcPr><w:tcW w:w="3500" w:type="dxa"/><w:noWrap/></w:tcPr><w:p><w:pPr/><w:r><w:rPr/><w:t xml:space="preserve">Wadah penyimpan data bebas dinamai programmer.</w:t></w:r></w:p></w:tc></w:tr><w:tr><w:trPr/><w:tc><w:tcPr><w:tcW w:w="3000" w:type="dxa"/><w:shd w:val="clear" w:fill="F8FAFC"/><w:noWrap/></w:tcPr><w:p><w:pPr/><w:r><w:rPr><w:b w:val="1"/><w:bCs w:val="1"/></w:rPr><w:t xml:space="preserve">Pesan Teks (Bebas)</w:t></w:r></w:p></w:tc><w:tc><w:tcPr><w:tcW w:w="3500" w:type="dxa"/><w:shd w:val="clear" w:fill="F8FAFC"/><w:noWrap/></w:tcPr><w:p><w:pPr/><w:r><w:rPr/><w:t xml:space="preserve">"Akses ditolak!", "Login Berhasil!"</w:t></w:r></w:p></w:tc><w:tc><w:tcPr><w:tcW w:w="3500" w:type="dxa"/><w:shd w:val="clear" w:fill="F8FAFC"/><w:noWrap/></w:tcPr><w:p><w:pPr/><w:r><w:rPr/><w:t xml:space="preserve">Bebas ditulis bahasa apapun untuk manusia.</w:t></w:r></w:p></w:tc></w:tr></w:tbl><w:p><w:r><w:br w:type="page"/></w:r></w:p><w:p><w:pPr><w:pStyle w:val="Heading1"/></w:pPr><w:bookmarkStart w:id="4" w:name="_Toc4"/><w:r><w:t>BAB 3: Database (Pondasi Penyimpanan Permanen)</w:t></w:r><w:bookmarkEnd w:id="4"/></w:p><w:p><w:pPr/><w:r><w:rPr/><w:t xml:space="preserve">Database relasional bekerja persis seperti Microsoft Excel: File = Database, Sheet = Tabel, Kolom Atas = Field, Baris = Data Record.</w:t></w:r></w:p><w:p><w:pPr/><w:r><w:rPr/><w:t xml:space="preserve">Di Laravel, tabel dirancang menggunakan file cetak biru yang disebut Migration agar pembuatan tabel bisa otomatis di server manapun.</w:t></w:r></w:p><w:p/><w:tbl><w:tblGrid><w:gridCol w:w="10000" w:type="dxa"/></w:tblGrid><w:tr><w:trPr/><w:tc><w:tcPr><w:tcW w:w="10000" w:type="dxa"/><w:shd w:val="clear" w:fill="0F172A"/><w:noWrap/></w:tcPr><w:p><w:pPr/><w:r><w:rPr><w:rFonts w:ascii="Courier New" w:hAnsi="Courier New" w:eastAsia="Courier New" w:cs="Courier New"/><w:color w:val="F8FAFC"/><w:sz w:val="19"/><w:szCs w:val="19"/></w:rPr><w:t xml:space="preserve">Schema::create('settings', function (Blueprint $table) {
-    $table->id();                                    // Nomor urut otomatis unik
-    $table->string('key');                           // Kolom teks pendek
-    $table->text('value')->nullable();               // Kolom teks panjang, BOLEH KOSONG
-    $table->foreignId('school_id')->nullable();       // Kunci penyambung ke tabel schools
-    $table->timestamps();                            // Otomatis membuat created_at & updated_at
-});</w:t></w:r></w:p></w:tc></w:tr></w:tbl><w:p/><w:p><w:pPr><w:pStyle w:val="Heading2"/></w:pPr><w:bookmarkStart w:id="5" w:name="_Toc5"/><w:r><w:t>Studi Kasus: cascadeOnDelete vs nullOnDelete</w:t></w:r><w:bookmarkEnd w:id="5"/></w:p><w:p><w:pPr/><w:r><w:rPr/><w:t xml:space="preserve">Jika sebuah Sekolah dihapus dari sistem:</w:t></w:r></w:p><w:p><w:pPr><w:numPr><w:ilvl w:val="0"/><w:numId w:val="4"/></w:numPr></w:pPr><w:r><w:rPr/><w:t xml:space="preserve">cascadeOnDelete(): Semua data terkait IKUT TERHAPUS PERMANEN (cocok untuk berkas SK sementara).</w:t></w:r></w:p><w:p><w:pPr><w:numPr><w:ilvl w:val="0"/><w:numId w:val="4"/></w:numPr></w:pPr><w:r><w:rPr/><w:t xml:space="preserve">nullOnDelete(): Data anak TETAP UTUH tersimpan, hanya school_id yang dikosongkan (WAJIB untuk data Absensi Guru demi keperluan audit sejarah & legal).</w:t></w:r></w:p><w:p><w:r><w:br w:type="page"/></w:r></w:p><w:p><w:pPr><w:pStyle w:val="Heading1"/></w:pPr><w:bookmarkStart w:id="6" w:name="_Toc6"/><w:r><w:t>BAB 4: Eloquent Model (Juru Bicara Database dalam MVC)</w:t></w:r><w:bookmarkEnd w:id="6"/></w:p><w:p><w:pPr/><w:r><w:rPr/><w:t xml:space="preserve">Model adalah file PHP yang bertindak sebagai juru bicara resmi untuk sebuah tabel di database. Kita tidak perlu menulis perintah SQL manual.</w:t></w:r></w:p><w:p/><w:tbl><w:tblGrid><w:gridCol w:w="10000" w:type="dxa"/></w:tblGrid><w:tr><w:trPr/><w:tc><w:tcPr><w:tcW w:w="10000" w:type="dxa"/><w:shd w:val="clear" w:fill="0F172A"/><w:noWrap/></w:tcPr><w:p><w:pPr/><w:r><w:rPr><w:rFonts w:ascii="Courier New" w:hAnsi="Courier New" w:eastAsia="Courier New" w:cs="Courier New"/><w:color w:val="F8FAFC"/><w:sz w:val="19"/><w:szCs w:val="19"/></w:rPr><w:t xml:space="preserve">class Setting extends Model
-{
-    // 1. SATPAM PINTU KOLOM (Mencegah peretasan Mass Assignment)
-    protected $fillable = ['key', 'value', 'storage_id', 'mime_type', 'school_id'];
-
-    // 2. HUBUNGAN KELUARGA DENGAN BAHASA MANUSIA
-    public function school() { 
-        return $this->belongsTo(School::class); 
-    }
-}</w:t></w:r></w:p></w:tc></w:tr></w:tbl><w:p/><w:p><w:pPr/><w:r><w:rPr/><w:t xml:space="preserve">Konsep MVC (Model-View-Controller): Model (Data & Database) - View (Tampilan Layar React) - Controller (Koki Pengatur Logika).</w:t></w:r></w:p><w:p><w:r><w:br w:type="page"/></w:r></w:p><w:p><w:pPr><w:pStyle w:val="Heading1"/></w:pPr><w:bookmarkStart w:id="7" w:name="_Toc7"/><w:r><w:t>BAB 5: Backend Controller (Koki Logika & Keamanan)</w:t></w:r><w:bookmarkEnd w:id="7"/></w:p><w:p><w:pPr/><w:r><w:rPr/><w:t xml:space="preserve">Controller bertugas memvalidasi data yang masuk dari formulir, memeriksa hak akses role pengguna, dan mengamankan isolasi tenant.</w:t></w:r></w:p><w:p/><w:tbl><w:tblGrid><w:gridCol w:w="10000" w:type="dxa"/></w:tblGrid><w:tr><w:trPr/><w:tc><w:tcPr><w:tcW w:w="10000" w:type="dxa"/><w:shd w:val="clear" w:fill="0F172A"/><w:noWrap/></w:tcPr><w:p><w:pPr/><w:r><w:rPr><w:rFonts w:ascii="Courier New" w:hAnsi="Courier New" w:eastAsia="Courier New" w:cs="Courier New"/><w:color w:val="F8FAFC"/><w:sz w:val="19"/><w:szCs w:val="19"/></w:rPr><w:t xml:space="preserve">public function store(Request $request): JsonResponse
-{
-    // 1. VALIDASI DATA MASUK
-    $request->validate([
-        'key'   => 'required|string|max:255',
-        'value' => 'nullable',
-    ]);
-
-    // 2. LOGIKA KEAMANAN ROLE (OTORISASI)
-    $user = $request->user();
-    if ($user?->isOperator() && $this->isSensitiveKey($request->key)) {
-        abort(403, 'Akses ditolak: Operator tidak dapat mengubah konfigurasi rahasia.');
-    }
-
-    // 3. MULTI-TENANCY (ISOLASI DATA ANTAR-SEKOLAH)
-    $schoolId = $user?->isOperator() ? $user->school_id : $request->input('school_id');
-
-    // 4. SIMPAN KE DATABASE
-    Setting::setValue($request->key, $request->value, $schoolId);
-
-    // 5. BALASAN KE FRONTEND
-    return response()->json(['success' => true]);
-}</w:t></w:r></w:p></w:tc></w:tr></w:tbl><w:p><w:r><w:br w:type="page"/></w:r></w:p><w:p><w:pPr><w:pStyle w:val="Heading1"/></w:pPr><w:bookmarkStart w:id="8" w:name="_Toc8"/><w:r><w:t>BAB 6: Frontend dengan React & TypeScript (Layar Interaktif)</w:t></w:r><w:bookmarkEnd w:id="8"/></w:p><w:p><w:pPr/><w:r><w:rPr/><w:t xml:space="preserve">Frontend modern dibangun dari HTML (Tulang), Tailwind CSS (Baju/Riasan), dan React/JavaScript (Otot & Otak).</w:t></w:r></w:p><w:p/><w:p><w:pPr><w:pStyle w:val="Heading2"/></w:pPr><w:bookmarkStart w:id="9" w:name="_Toc9"/><w:r><w:t>Konsep Sakti: State (Ingatan Jangka Pendek Komponen)</w:t></w:r><w:bookmarkEnd w:id="9"/></w:p><w:p><w:pPr/><w:r><w:rPr/><w:t xml:space="preserve">State memungkinkan aplikasi mengingat kondisi interaksi pengguna, seperti tombol intip password di halaman login SIMMACI:</w:t></w:r></w:p><w:p/><w:tbl><w:tblGrid><w:gridCol w:w="10000" w:type="dxa"/></w:tblGrid><w:tr><w:trPr/><w:tc><w:tcPr><w:tcW w:w="10000" w:type="dxa"/><w:shd w:val="clear" w:fill="0F172A"/><w:noWrap/></w:tcPr><w:p><w:pPr/><w:r><w:rPr><w:rFonts w:ascii="Courier New" w:hAnsi="Courier New" w:eastAsia="Courier New" w:cs="Courier New"/><w:color w:val="F8FAFC"/><w:sz w:val="19"/><w:szCs w:val="19"/></w:rPr><w:t xml:space="preserve">// 1. Mengingat kondisi: apakah sedang diintip atau disembunyikan?
-const [showPassword, setShowPassword] = useState(false);
-
-// 2. Input berganti tipe otomatis sesuai ingatan State:
-<Input type={showPassword ? 'text' : 'password'} placeholder='***' />
-
-// 3. Tombol mata membalik kondisi State saat diklik:
-<button onClick={() => setShowPassword(!showPassword)}>
-  {showPassword ? <EyeOff /> : <Eye />}
-</button></w:t></w:r></w:p></w:tc></w:tr></w:tbl><w:p><w:r><w:br w:type="page"/></w:r></w:p><w:p><w:pPr><w:pStyle w:val="Heading1"/></w:pPr><w:bookmarkStart w:id="10" w:name="_Toc10"/><w:r><w:t>BAB 7: Glosarium Istilah Penting Fullstack Developer</w:t></w:r><w:bookmarkEnd w:id="10"/></w:p><w:tbl><w:tblGrid><w:gridCol w:w="3000" w:type="dxa"/><w:gridCol w:w="7000" w:type="dxa"/></w:tblGrid><w:tblPr><w:tblStyle w:val="TableGlosarium"/></w:tblPr><w:tr><w:trPr/><w:tc><w:tcPr><w:tcW w:w="3000" w:type="dxa"/><w:shd w:val="clear" w:fill="065F46"/><w:noWrap/></w:tcPr><w:p><w:pPr/><w:r><w:rPr><w:color w:val="FFFFFF"/><w:b w:val="1"/><w:bCs w:val="1"/></w:rPr><w:t xml:space="preserve">Istilah Teknis</w:t></w:r></w:p></w:tc><w:tc><w:tcPr><w:tcW w:w="7000" w:type="dxa"/><w:shd w:val="clear" w:fill="065F46"/><w:noWrap/></w:tcPr><w:p><w:pPr/><w:r><w:rPr><w:color w:val="FFFFFF"/><w:b w:val="1"/><w:bCs w:val="1"/></w:rPr><w:t xml:space="preserve">Artinya dalam Bahasa Manusia Awam</w:t></w:r></w:p></w:tc></w:tr><w:tr><w:trPr/><w:tc><w:tcPr><w:tcW w:w="3000" w:type="dxa"/><w:noWrap/></w:tcPr><w:p><w:pPr/><w:r><w:rPr><w:b w:val="1"/><w:bCs w:val="1"/></w:rPr><w:t xml:space="preserve">Frontend</w:t></w:r></w:p></w:tc><w:tc><w:tcPr><w:tcW w:w="7000" w:type="dxa"/><w:noWrap/></w:tcPr><w:p><w:pPr/><w:r><w:rPr/><w:t xml:space="preserve">Semua antarmuka visual yang dilihat dan disentuh pengguna di browser (React + Tailwind).</w:t></w:r></w:p></w:tc></w:tr><w:tr><w:trPr/><w:tc><w:tcPr><w:tcW w:w="3000" w:type="dxa"/><w:shd w:val="clear" w:fill="F8FAFC"/><w:noWrap/></w:tcPr><w:p><w:pPr/><w:r><w:rPr><w:b w:val="1"/><w:bCs w:val="1"/></w:rPr><w:t xml:space="preserve">Backend</w:t></w:r></w:p></w:tc><w:tc><w:tcPr><w:tcW w:w="7000" w:type="dxa"/><w:shd w:val="clear" w:fill="F8FAFC"/><w:noWrap/></w:tcPr><w:p><w:pPr/><w:r><w:rPr/><w:t xml:space="preserve">Dapur server pengolah logika dan keamanan data di balik layar (Laravel PHP).</w:t></w:r></w:p></w:tc></w:tr><w:tr><w:trPr/><w:tc><w:tcPr><w:tcW w:w="3000" w:type="dxa"/><w:noWrap/></w:tcPr><w:p><w:pPr/><w:r><w:rPr><w:b w:val="1"/><w:bCs w:val="1"/></w:rPr><w:t xml:space="preserve">API (HTTP)</w:t></w:r></w:p></w:tc><w:tc><w:tcPr><w:tcW w:w="7000" w:type="dxa"/><w:noWrap/></w:tcPr><w:p><w:pPr/><w:r><w:rPr/><w:t xml:space="preserve">Pelayan pengantar pesan data bolak-balik antara Frontend dan Backend lewat internet.</w:t></w:r></w:p></w:tc></w:tr><w:tr><w:trPr/><w:tc><w:tcPr><w:tcW w:w="3000" w:type="dxa"/><w:shd w:val="clear" w:fill="F8FAFC"/><w:noWrap/></w:tcPr><w:p><w:pPr/><w:r><w:rPr><w:b w:val="1"/><w:bCs w:val="1"/></w:rPr><w:t xml:space="preserve">JSON</w:t></w:r></w:p></w:tc><w:tc><w:tcPr><w:tcW w:w="7000" w:type="dxa"/><w:shd w:val="clear" w:fill="F8FAFC"/><w:noWrap/></w:tcPr><w:p><w:pPr/><w:r><w:rPr/><w:t xml:space="preserve">Format teks nota standar untuk pertukaran data antar sistem komputer.</w:t></w:r></w:p></w:tc></w:tr><w:tr><w:trPr/><w:tc><w:tcPr><w:tcW w:w="3000" w:type="dxa"/><w:noWrap/></w:tcPr><w:p><w:pPr/><w:r><w:rPr><w:b w:val="1"/><w:bCs w:val="1"/></w:rPr><w:t xml:space="preserve">Database (RDBMS)</w:t></w:r></w:p></w:tc><w:tc><w:tcPr><w:tcW w:w="7000" w:type="dxa"/><w:noWrap/></w:tcPr><w:p><w:pPr/><w:r><w:rPr/><w:t xml:space="preserve">Gudang penyimpanan data permanen terstruktur dengan tabel-tabel bersaudara (PostgreSQL).</w:t></w:r></w:p></w:tc></w:tr><w:tr><w:trPr/><w:tc><w:tcPr><w:tcW w:w="3000" w:type="dxa"/><w:shd w:val="clear" w:fill="F8FAFC"/><w:noWrap/></w:tcPr><w:p><w:pPr/><w:r><w:rPr><w:b w:val="1"/><w:bCs w:val="1"/></w:rPr><w:t xml:space="preserve">Migration</w:t></w:r></w:p></w:tc><w:tc><w:tcPr><w:tcW w:w="7000" w:type="dxa"/><w:shd w:val="clear" w:fill="F8FAFC"/><w:noWrap/></w:tcPr><w:p><w:pPr/><w:r><w:rPr/><w:t xml:space="preserve">Cetak biru kode untuk merancang tabel database secara otomatis.</w:t></w:r></w:p></w:tc></w:tr><w:tr><w:trPr/><w:tc><w:tcPr><w:tcW w:w="3000" w:type="dxa"/><w:noWrap/></w:tcPr><w:p><w:pPr/><w:r><w:rPr><w:b w:val="1"/><w:bCs w:val="1"/></w:rPr><w:t xml:space="preserve">Model (ORM)</w:t></w:r></w:p></w:tc><w:tc><w:tcPr><w:tcW w:w="7000" w:type="dxa"/><w:noWrap/></w:tcPr><w:p><w:pPr/><w:r><w:rPr/><w:t xml:space="preserve">Juru bicara representasi tabel database di dalam kode PHP (Eloquent).</w:t></w:r></w:p></w:tc></w:tr><w:tr><w:trPr/><w:tc><w:tcPr><w:tcW w:w="3000" w:type="dxa"/><w:shd w:val="clear" w:fill="F8FAFC"/><w:noWrap/></w:tcPr><w:p><w:pPr/><w:r><w:rPr><w:b w:val="1"/><w:bCs w:val="1"/></w:rPr><w:t xml:space="preserve">Controller</w:t></w:r></w:p></w:tc><w:tc><w:tcPr><w:tcW w:w="7000" w:type="dxa"/><w:shd w:val="clear" w:fill="F8FAFC"/><w:noWrap/></w:tcPr><w:p><w:pPr/><w:r><w:rPr/><w:t xml:space="preserve">Koki pengatur alur kerja: validasi, otorisasi, dan pengambil keputusan data.</w:t></w:r></w:p></w:tc></w:tr><w:tr><w:trPr/><w:tc><w:tcPr><w:tcW w:w="3000" w:type="dxa"/><w:noWrap/></w:tcPr><w:p><w:pPr/><w:r><w:rPr><w:b w:val="1"/><w:bCs w:val="1"/></w:rPr><w:t xml:space="preserve">Validation</w:t></w:r></w:p></w:tc><w:tc><w:tcPr><w:tcW w:w="7000" w:type="dxa"/><w:noWrap/></w:tcPr><w:p><w:pPr/><w:r><w:rPr/><w:t xml:space="preserve">Pemeriksaan kelayakan format data sebelum diizinkan masuk ke database.</w:t></w:r></w:p></w:tc></w:tr><w:tr><w:trPr/><w:tc><w:tcPr><w:tcW w:w="3000" w:type="dxa"/><w:shd w:val="clear" w:fill="F8FAFC"/><w:noWrap/></w:tcPr><w:p><w:pPr/><w:r><w:rPr><w:b w:val="1"/><w:bCs w:val="1"/></w:rPr><w:t xml:space="preserve">Authorization</w:t></w:r></w:p></w:tc><w:tc><w:tcPr><w:tcW w:w="7000" w:type="dxa"/><w:shd w:val="clear" w:fill="F8FAFC"/><w:noWrap/></w:tcPr><w:p><w:pPr/><w:r><w:rPr/><w:t xml:space="preserve">Pemeriksaan hak akses keamanan (apakah pengguna ini berhak mengubah data tersebut).</w:t></w:r></w:p></w:tc></w:tr><w:tr><w:trPr/><w:tc><w:tcPr><w:tcW w:w="3000" w:type="dxa"/><w:noWrap/></w:tcPr><w:p><w:pPr/><w:r><w:rPr><w:b w:val="1"/><w:bCs w:val="1"/></w:rPr><w:t xml:space="preserve">State (useState)</w:t></w:r></w:p></w:tc><w:tc><w:tcPr><w:tcW w:w="7000" w:type="dxa"/><w:noWrap/></w:tcPr><w:p><w:pPr/><w:r><w:rPr/><w:t xml:space="preserve">Ingatan jangka pendek komponen di browser yang membuat layar reaktif seketika.</w:t></w:r></w:p></w:tc></w:tr><w:tr><w:trPr/><w:tc><w:tcPr><w:tcW w:w="3000" w:type="dxa"/><w:shd w:val="clear" w:fill="F8FAFC"/><w:noWrap/></w:tcPr><w:p><w:pPr/><w:r><w:rPr><w:b w:val="1"/><w:bCs w:val="1"/></w:rPr><w:t xml:space="preserve">Multi-Tenancy</w:t></w:r></w:p></w:tc><w:tc><w:tcPr><w:tcW w:w="7000" w:type="dxa"/><w:shd w:val="clear" w:fill="F8FAFC"/><w:noWrap/></w:tcPr><w:p><w:pPr/><w:r><w:rPr/><w:t xml:space="preserve">Arsitektur satu sistem yang melayani banyak sekolah tanpa saling bocor data.</w:t></w:r></w:p></w:tc></w:tr><w:tr><w:trPr/><w:tc><w:tcPr><w:tcW w:w="3000" w:type="dxa"/><w:noWrap/></w:tcPr><w:p><w:pPr/><w:r><w:rPr><w:b w:val="1"/><w:bCs w:val="1"/></w:rPr><w:t xml:space="preserve">nullOnDelete</w:t></w:r></w:p></w:tc><w:tc><w:tcPr><w:tcW w:w="7000" w:type="dxa"/><w:noWrap/></w:tcPr><w:p><w:pPr/><w:r><w:rPr/><w:t xml:space="preserve">Pengamanan data riwayat agar tidak terhapus saat sekolah dihapus demi keperluan audit.</w:t></w:r></w:p></w:tc></w:tr></w:tbl><w:p/><w:p/><w:p><w:pPr><w:jc w:val="center"/></w:pPr><w:r><w:rPr><w:color w:val="065F46"/><w:b w:val="1"/><w:bCs w:val="1"/></w:rPr><w:t xml:space="preserve">Selamat! Anda telah menguasai fondasi arsitektur Fullstack Developer profesional.</w:t></w:r></w:p><w:p><w:pPr><w:jc w:val="center"/></w:pPr><w:r><w:rPr><w:color w:val="94A3B8"/><w:i w:val="1"/><w:iCs w:val="1"/></w:rPr><w:t xml:space="preserve">Lembaga Pendidikan Ma'arif NU Cilacap &bull; 2026</w:t></w:r></w:p><w:sectPr><w:pgSz w:orient="portrait" w:w="11905.511811023622" w:h="16837.79527559055"/><w:pgMar w:top="1200" w:right="1200" w:bottom="1200" w:left="1200" w:header="720" w:footer="720" w:gutter="0"/><w:cols w:num="1" w:space="720"/></w:sectPr></w:body></w:document>
+<w:document xmlns:ve="http://schemas.openxmlformats.org/markup-compatibility/2006" xmlns:o="urn:schemas-microsoft-com:office:office" xmlns:r="http://schemas.openxmlformats.org/officeDocument/2006/relationships" xmlns:m="http://schemas.openxmlformats.org/officeDocument/2006/math" xmlns:v="urn:schemas-microsoft-com:vml" xmlns:wp="http://schemas.openxmlformats.org/drawingml/2006/wordprocessingDrawing" xmlns:w10="urn:schemas-microsoft-com:office:word" xmlns:w="http://schemas.openxmlformats.org/wordprocessingml/2006/main" xmlns:wne="http://schemas.microsoft.com/office/word/2006/wordml"><w:body><w:p><w:pPr><w:jc w:val="center"/></w:pPr><w:r><w:rPr><w:color w:val="047857"/><w:sz w:val="20"/><w:szCs w:val="20"/><w:b w:val="1"/><w:bCs w:val="1"/></w:rPr><w:t xml:space="preserve">MODUL BINAAN RESMI &bull; EDISI LENGKAP V2</w:t></w:r></w:p><w:p/><w:p><w:pPr><w:jc w:val="center"/></w:pPr><w:r><w:rPr><w:color w:val="064E3B"/><w:sz w:val="44"/><w:szCs w:val="44"/><w:b w:val="1"/><w:bCs w:val="1"/></w:rPr><w:t xml:space="preserve">PANDUAN FUNDAMENTAL FULLSTACK DEVELOPER</w:t></w:r></w:p><w:p><w:pPr><w:jc w:val="center"/></w:pPr><w:r><w:rPr><w:color w:val="475569"/><w:sz w:val="22"/><w:szCs w:val="22"/><w:i w:val="1"/><w:iCs w:val="1"/></w:rPr><w:t xml:space="preserve">Dari Konsep Dasar, CRUD, Keamanan Siber (Defense in Depth), Hingga Audit Trail Berbasis Kode Nyata SIMMACI</w:t></w:r></w:p><w:p/><w:p/><w:p><w:pPr><w:jc w:val="center"/></w:pPr><w:r><w:rPr><w:b w:val="1"/><w:bCs w:val="1"/></w:rPr><w:t xml:space="preserve">Disusun Khusus Untuk: Penguasaan Arsitektur & Logika Software SIMMACI</w:t></w:r></w:p><w:p><w:pPr><w:jc w:val="center"/></w:pPr><w:r><w:rPr/><w:t xml:space="preserve">Teknologi: React 19 + TypeScript + Laravel 12 + PostgreSQL + Tailwind CSS</w:t></w:r></w:p><w:p><w:pPr><w:jc w:val="center"/></w:pPr><w:r><w:rPr/><w:t xml:space="preserve">Tingkat: Pemula Tanpa Dasar Coding Menuju Pemahaman Engineer Profesional</w:t></w:r></w:p><w:p><w:pPr><w:jc w:val="center"/></w:pPr><w:r><w:rPr/><w:t xml:space="preserve">Tahun Terbit: September 2026</w:t></w:r></w:p><w:p><w:r><w:br w:type="page"/></w:r></w:p><w:p><w:pPr><w:pStyle w:val="Heading1"/></w:pPr><w:bookmarkStart w:id="0" w:name="_Toc0"/><w:r><w:t>BAB 1: Peta Besar Fullstack (Analogi Restoran)</w:t></w:r><w:bookmarkEnd w:id="0"/></w:p><w:p><w:pPr/><w:r><w:rPr/><w:t xml:space="preserve">Aplikasi website modern bekerja persis seperti Restoran: Frontend (Meja Pelanggan), API (Pelayan Kurir JSON), Backend (Dapur & Koki Laravel), Database (Gudang & Kulkas PostgreSQL).</w:t></w:r></w:p><w:p><w:pPr><w:numPr><w:ilvl w:val="0"/><w:numId w:val="3"/></w:numPr></w:pPr><w:r><w:rPr/><w:t xml:space="preserve">1. User Trigger: Pengguna mengklik tombol di layar React.</w:t></w:r></w:p><w:p><w:pPr><w:numPr><w:ilvl w:val="0"/><w:numId w:val="3"/></w:numPr></w:pPr><w:r><w:rPr/><w:t xml:space="preserve">2. API Request: Data dikirimkan dalam format JSON via HTTP POST/GET.</w:t></w:r></w:p><w:p><w:pPr><w:numPr><w:ilvl w:val="0"/><w:numId w:val="3"/></w:numPr></w:pPr><w:r><w:rPr/><w:t xml:space="preserve">3. Routing: Laravel mengarahkan paket ke Controller yang tepat.</w:t></w:r></w:p><w:p><w:pPr><w:numPr><w:ilvl w:val="0"/><w:numId w:val="3"/></w:numPr></w:pPr><w:r><w:rPr/><w:t xml:space="preserve">4. Validasi & Keamanan: Koki memeriksa data dan hak akses peran pengguna.</w:t></w:r></w:p><w:p><w:pPr><w:numPr><w:ilvl w:val="0"/><w:numId w:val="3"/></w:numPr></w:pPr><w:r><w:rPr/><w:t xml:space="preserve">5. Database Query: Data disimpan atau diambil lewat Eloquent Model.</w:t></w:r></w:p><w:p><w:pPr><w:numPr><w:ilvl w:val="0"/><w:numId w:val="3"/></w:numPr></w:pPr><w:r><w:rPr/><w:t xml:space="preserve">6. API Response: Koki mengembalikan nota status { "success": true }.</w:t></w:r></w:p><w:p><w:pPr><w:numPr><w:ilvl w:val="0"/><w:numId w:val="3"/></w:numPr></w:pPr><w:r><w:rPr/><w:t xml:space="preserve">7. Reaktivitas Layar: Layar memunculkan Toast notifikasi dan meng-update tabel seketika.</w:t></w:r></w:p><w:p><w:r><w:br w:type="page"/></w:r></w:p><w:p><w:pPr><w:pStyle w:val="Heading1"/></w:pPr><w:bookmarkStart w:id="1" w:name="_Toc1"/><w:r><w:t>BAB 2: Anatomi Bahasa Coding (Baku vs Bebas)</w:t></w:r><w:bookmarkEnd w:id="1"/></w:p><w:p><w:pPr/><w:r><w:rPr/><w:t xml:space="preserve">Bahasa coding baku dan kaku pada sintaks (kata kunci dan tanda baca), namun bebas pada penamaan variabel dan teks pesan.</w:t></w:r></w:p><w:p><w:pPr/><w:r><w:rPr/><w:t xml:space="preserve">Komputer tidak punya akal sehat. Typo satu huruf menyebabkan Syntax Error.</w:t></w:r></w:p><w:p><w:r><w:br w:type="page"/></w:r></w:p><w:p><w:pPr><w:pStyle w:val="Heading1"/></w:pPr><w:bookmarkStart w:id="2" w:name="_Toc2"/><w:r><w:t>BAB 3 & 4: Database, Migration, & Eloquent Model</w:t></w:r><w:bookmarkEnd w:id="2"/></w:p><w:p><w:pPr/><w:r><w:rPr/><w:t xml:space="preserve">Database = File Excel, Tabel = Sheet, Field = Kolom Header, Record = Baris Data.</w:t></w:r></w:p><w:p><w:pPr/><w:r><w:rPr/><w:t xml:space="preserve">Migration adalah cetak biru kode otomatis agar tabel database bisa dibuat serentak di server manapun.</w:t></w:r></w:p><w:p><w:pPr/><w:r><w:rPr/><w:t xml:space="preserve">cascadeOnDelete: Hapus induk maka anak ikut hancur permanen.</w:t></w:r></w:p><w:p><w:pPr/><w:r><w:rPr/><w:t xml:space="preserve">nullOnDelete: Hapus induk maka anak tetap utuh tersimpan (WAJIB untuk data Absensi Guru demi keperluan audit sejarah).</w:t></w:r></w:p><w:p><w:pPr/><w:r><w:rPr/><w:t xml:space="preserve">Model Eloquent adalah juru bicara resmi tabel: $fillable (satpam pintu kolom), belongsTo (milik dari), hasMany (punya banyak).</w:t></w:r></w:p><w:p><w:r><w:br w:type="page"/></w:r></w:p><w:p><w:pPr><w:pStyle w:val="Heading1"/></w:pPr><w:bookmarkStart w:id="3" w:name="_Toc3"/><w:r><w:t>BAB 5 & 6: Controller & Frontend State</w:t></w:r><w:bookmarkEnd w:id="3"/></w:p><w:p><w:pPr/><w:r><w:rPr/><w:t xml:space="preserve">Controller memeriksa validasi (required|string|max:255, nullable) dan mengamankan isolasi tenant.</w:t></w:r></w:p><w:p><w:pPr/><w:r><w:rPr/><w:t xml:space="preserve">Frontend State (useState) adalah ingatan jangka pendek komponen yang memungkinkan tampilan reaktif (misal tombol intip mata password di LoginPage).</w:t></w:r></w:p><w:p><w:r><w:br w:type="page"/></w:r></w:p><w:p><w:pPr><w:pStyle w:val="Heading1"/></w:pPr><w:bookmarkStart w:id="4" w:name="_Toc4"/><w:r><w:t>BAB 8: Jantung Web Developer: Siklus Hidup "CRUD"</w:t></w:r><w:bookmarkEnd w:id="4"/></w:p><w:p><w:pPr/><w:r><w:rPr/><w:t xml:space="preserve">95% aplikasi di dunia melakukan 4 aksi pokok CRUD:</w:t></w:r></w:p><w:p><w:pPr><w:numPr><w:ilvl w:val="0"/><w:numId w:val="3"/></w:numPr></w:pPr><w:r><w:rPr/><w:t xml:space="preserve">Create (POST) -> store(): Menambah data baru.</w:t></w:r></w:p><w:p><w:pPr><w:numPr><w:ilvl w:val="0"/><w:numId w:val="3"/></w:numPr></w:pPr><w:r><w:rPr/><w:t xml:space="preserve">Read (GET) -> index() & show(): Menampilkan tabel data dan rincian profil.</w:t></w:r></w:p><w:p><w:pPr><w:numPr><w:ilvl w:val="0"/><w:numId w:val="3"/></w:numPr></w:pPr><w:r><w:rPr/><w:t xml:space="preserve">Update (PUT/PATCH) -> update(): Mengedit data lama.</w:t></w:r></w:p><w:p><w:pPr><w:numPr><w:ilvl w:val="0"/><w:numId w:val="3"/></w:numPr></w:pPr><w:r><w:rPr/><w:t xml:space="preserve">Delete (DELETE) -> destroy(): Menghapus data dari sistem.</w:t></w:r></w:p><w:p/><w:p><w:pPr><w:pStyle w:val="Heading2"/></w:pPr><w:bookmarkStart w:id="5" w:name="_Toc5"/><w:r><w:t>Pencarian, Filter, & Paginasi di Backend:</w:t></w:r><w:bookmarkEnd w:id="5"/></w:p><w:p><w:pPr/><w:r><w:rPr/><w:t xml:space="preserve">1. Pencarian: where("nama", "LIKE", "%...%") -> mencari yang mengandung kata.</w:t></w:r></w:p><w:p><w:pPr/><w:r><w:rPr/><w:t xml:space="preserve">2. Filter Wilayah: where("kecamatan", $kecamatan) -> menyaring sekolah wilayah tertentu.</w:t></w:r></w:p><w:p><w:pPr/><w:r><w:rPr/><w:t xml:space="preserve">3. Paginasi: paginate(15) -> membagi per 15 baris agar aplikasi tetap kencang.</w:t></w:r></w:p><w:p><w:pPr/><w:r><w:rPr/><w:t xml:space="preserve">4. Di Frontend: fungsi .map() mencetak data array menjadi baris-baris tabel secara otomatis.</w:t></w:r></w:p><w:p><w:r><w:br w:type="page"/></w:r></w:p><w:p><w:pPr><w:pStyle w:val="Heading1"/></w:pPr><w:bookmarkStart w:id="6" w:name="_Toc6"/><w:r><w:t>BAB 9: Keamanan Siber & Prinsip "Defense in Depth"</w:t></w:r><w:bookmarkEnd w:id="6"/></w:p><w:p><w:pPr/><w:r><w:rPr/><w:t xml:space="preserve">Kaidah Emas: NEVER TRUST THE FRONTEND (Jangan percaya hanya pada tampilan frontend).</w:t></w:r></w:p><w:p><w:pPr/><w:r><w:rPr/><w:t xml:space="preserve">Lapis 1 (Frontend): Tombol Hapus disembunyikan untuk operator biasa demi kenyamanan.</w:t></w:r></w:p><w:p><w:pPr/><w:r><w:rPr/><w:t xml:space="preserve">Lapis 2 (Backend): Hacker bisa memalsukan klik langsung ke API. Maka di Backend Controller fungsi destroy() WAJIB mencegat dengan status 403 jika bukan Super Admin.</w:t></w:r></w:p><w:p><w:r><w:br w:type="page"/></w:r></w:p><w:p><w:pPr><w:pStyle w:val="Heading1"/></w:pPr><w:bookmarkStart w:id="7" w:name="_Toc7"/><w:r><w:t>BAB 10: Audit Trail (Kotak Hitam Rekaman Jejak Sistem)</w:t></w:r><w:bookmarkEnd w:id="7"/></w:p><w:p><w:pPr/><w:r><w:rPr/><w:t xml:space="preserve">Setiap aksi perubahan penting dicatat ke tabel activity_logs:</w:t></w:r></w:p><w:p><w:pPr><w:numPr><w:ilvl w:val="0"/><w:numId w:val="3"/></w:numPr></w:pPr><w:r><w:rPr/><w:t xml:space="preserve">subject_id: Objek / Sekolah yang menjadi sasaran aksi.</w:t></w:r></w:p><w:p><w:pPr><w:numPr><w:ilvl w:val="0"/><w:numId w:val="3"/></w:numPr></w:pPr><w:r><w:rPr/><w:t xml:space="preserve">causer_id: ID Akun Pengguna yang melakukan aksi.</w:t></w:r></w:p><w:p/><w:p><w:pPr><w:pStyle w:val="Heading2"/></w:pPr><w:bookmarkStart w:id="8" w:name="_Toc8"/><w:r><w:t>Mengapa Dicatat Angka ID Akun (Bukan Teks Nama Orang)?</w:t></w:r><w:bookmarkEnd w:id="8"/></w:p><w:p><w:pPr><w:numPr><w:ilvl w:val="0"/><w:numId w:val="3"/></w:numPr></w:pPr><w:r><w:rPr/><w:t xml:space="preserve">1. Nama orang bisa diedit atau ganti gelar, sedangkan ID abadi (seperti NIK KTP).</w:t></w:r></w:p><w:p><w:pPr><w:numPr><w:ilvl w:val="0"/><w:numId w:val="3"/></w:numPr></w:pPr><w:r><w:rPr/><w:t xml:space="preserve">2. Relasi Eloquent bisa menarik nama, email, dan no WhatsApp pelaku kapan saja.</w:t></w:r></w:p><w:p><w:pPr><w:numPr><w:ilvl w:val="0"/><w:numId w:val="3"/></w:numPr></w:pPr><w:r><w:rPr/><w:t xml:space="preserve">3. Menghemat ukuran harddisk database secara signifikan.</w:t></w:r></w:p><w:p><w:r><w:br w:type="page"/></w:r></w:p><w:p><w:pPr><w:pStyle w:val="Heading1"/></w:pPr><w:bookmarkStart w:id="9" w:name="_Toc9"/><w:r><w:t>BAB 11: Glosarium Lengkap Istilah Fullstack Developer</w:t></w:r><w:bookmarkEnd w:id="9"/></w:p><w:tbl><w:tblGrid><w:gridCol w:w="3000" w:type="dxa"/><w:gridCol w:w="7000" w:type="dxa"/></w:tblGrid><w:tblPr><w:tblStyle w:val="TableGlosariumV2"/></w:tblPr><w:tr><w:trPr/><w:tc><w:tcPr><w:tcW w:w="3000" w:type="dxa"/><w:shd w:val="clear" w:fill="065F46"/><w:noWrap/></w:tcPr><w:p><w:pPr/><w:r><w:rPr><w:color w:val="FFFFFF"/><w:b w:val="1"/><w:bCs w:val="1"/></w:rPr><w:t xml:space="preserve">Istilah Teknis</w:t></w:r></w:p></w:tc><w:tc><w:tcPr><w:tcW w:w="7000" w:type="dxa"/><w:shd w:val="clear" w:fill="065F46"/><w:noWrap/></w:tcPr><w:p><w:pPr/><w:r><w:rPr><w:color w:val="FFFFFF"/><w:b w:val="1"/><w:bCs w:val="1"/></w:rPr><w:t xml:space="preserve">Artinya dalam Bahasa Manusia Awam</w:t></w:r></w:p></w:tc></w:tr><w:tr><w:trPr/><w:tc><w:tcPr><w:tcW w:w="3000" w:type="dxa"/><w:noWrap/></w:tcPr><w:p><w:pPr/><w:r><w:rPr><w:b w:val="1"/><w:bCs w:val="1"/></w:rPr><w:t xml:space="preserve">Frontend</w:t></w:r></w:p></w:tc><w:tc><w:tcPr><w:tcW w:w="7000" w:type="dxa"/><w:noWrap/></w:tcPr><w:p><w:pPr/><w:r><w:rPr/><w:t xml:space="preserve">Semua antarmuka visual yang dilihat pengguna di browser (React + Tailwind).</w:t></w:r></w:p></w:tc></w:tr><w:tr><w:trPr/><w:tc><w:tcPr><w:tcW w:w="3000" w:type="dxa"/><w:shd w:val="clear" w:fill="F8FAFC"/><w:noWrap/></w:tcPr><w:p><w:pPr/><w:r><w:rPr><w:b w:val="1"/><w:bCs w:val="1"/></w:rPr><w:t xml:space="preserve">Backend</w:t></w:r></w:p></w:tc><w:tc><w:tcPr><w:tcW w:w="7000" w:type="dxa"/><w:shd w:val="clear" w:fill="F8FAFC"/><w:noWrap/></w:tcPr><w:p><w:pPr/><w:r><w:rPr/><w:t xml:space="preserve">Dapur server pengolah logika dan keamanan data di balik layar (Laravel PHP).</w:t></w:r></w:p></w:tc></w:tr><w:tr><w:trPr/><w:tc><w:tcPr><w:tcW w:w="3000" w:type="dxa"/><w:noWrap/></w:tcPr><w:p><w:pPr/><w:r><w:rPr><w:b w:val="1"/><w:bCs w:val="1"/></w:rPr><w:t xml:space="preserve">API (HTTP)</w:t></w:r></w:p></w:tc><w:tc><w:tcPr><w:tcW w:w="7000" w:type="dxa"/><w:noWrap/></w:tcPr><w:p><w:pPr/><w:r><w:rPr/><w:t xml:space="preserve">Pelayan kurir pengantar paket nota data bolak-balik antara Frontend dan Backend.</w:t></w:r></w:p></w:tc></w:tr><w:tr><w:trPr/><w:tc><w:tcPr><w:tcW w:w="3000" w:type="dxa"/><w:shd w:val="clear" w:fill="F8FAFC"/><w:noWrap/></w:tcPr><w:p><w:pPr/><w:r><w:rPr><w:b w:val="1"/><w:bCs w:val="1"/></w:rPr><w:t xml:space="preserve">JSON</w:t></w:r></w:p></w:tc><w:tc><w:tcPr><w:tcW w:w="7000" w:type="dxa"/><w:shd w:val="clear" w:fill="F8FAFC"/><w:noWrap/></w:tcPr><w:p><w:pPr/><w:r><w:rPr/><w:t xml:space="preserve">Format teks nota standar untuk pertukaran data antar komputer.</w:t></w:r></w:p></w:tc></w:tr><w:tr><w:trPr/><w:tc><w:tcPr><w:tcW w:w="3000" w:type="dxa"/><w:noWrap/></w:tcPr><w:p><w:pPr/><w:r><w:rPr><w:b w:val="1"/><w:bCs w:val="1"/></w:rPr><w:t xml:space="preserve">Database (RDBMS)</w:t></w:r></w:p></w:tc><w:tc><w:tcPr><w:tcW w:w="7000" w:type="dxa"/><w:noWrap/></w:tcPr><w:p><w:pPr/><w:r><w:rPr/><w:t xml:space="preserve">Gudang penyimpanan data permanen terstruktur dengan tabel-tabel bersaudara.</w:t></w:r></w:p></w:tc></w:tr><w:tr><w:trPr/><w:tc><w:tcPr><w:tcW w:w="3000" w:type="dxa"/><w:shd w:val="clear" w:fill="F8FAFC"/><w:noWrap/></w:tcPr><w:p><w:pPr/><w:r><w:rPr><w:b w:val="1"/><w:bCs w:val="1"/></w:rPr><w:t xml:space="preserve">Migration</w:t></w:r></w:p></w:tc><w:tc><w:tcPr><w:tcW w:w="7000" w:type="dxa"/><w:shd w:val="clear" w:fill="F8FAFC"/><w:noWrap/></w:tcPr><w:p><w:pPr/><w:r><w:rPr/><w:t xml:space="preserve">Cetak biru kode untuk merancang tabel database secara otomatis.</w:t></w:r></w:p></w:tc></w:tr><w:tr><w:trPr/><w:tc><w:tcPr><w:tcW w:w="3000" w:type="dxa"/><w:noWrap/></w:tcPr><w:p><w:pPr/><w:r><w:rPr><w:b w:val="1"/><w:bCs w:val="1"/></w:rPr><w:t xml:space="preserve">Model (ORM)</w:t></w:r></w:p></w:tc><w:tc><w:tcPr><w:tcW w:w="7000" w:type="dxa"/><w:noWrap/></w:tcPr><w:p><w:pPr/><w:r><w:rPr/><w:t xml:space="preserve">Juru bicara representasi tabel database di dalam kode PHP (Eloquent).</w:t></w:r></w:p></w:tc></w:tr><w:tr><w:trPr/><w:tc><w:tcPr><w:tcW w:w="3000" w:type="dxa"/><w:shd w:val="clear" w:fill="F8FAFC"/><w:noWrap/></w:tcPr><w:p><w:pPr/><w:r><w:rPr><w:b w:val="1"/><w:bCs w:val="1"/></w:rPr><w:t xml:space="preserve">Controller</w:t></w:r></w:p></w:tc><w:tc><w:tcPr><w:tcW w:w="7000" w:type="dxa"/><w:shd w:val="clear" w:fill="F8FAFC"/><w:noWrap/></w:tcPr><w:p><w:pPr/><w:r><w:rPr/><w:t xml:space="preserve">Koki pengatur alur kerja: validasi, otorisasi, dan pengambil keputusan data.</w:t></w:r></w:p></w:tc></w:tr><w:tr><w:trPr/><w:tc><w:tcPr><w:tcW w:w="3000" w:type="dxa"/><w:noWrap/></w:tcPr><w:p><w:pPr/><w:r><w:rPr><w:b w:val="1"/><w:bCs w:val="1"/></w:rPr><w:t xml:space="preserve">CRUD</w:t></w:r></w:p></w:tc><w:tc><w:tcPr><w:tcW w:w="7000" w:type="dxa"/><w:noWrap/></w:tcPr><w:p><w:pPr/><w:r><w:rPr/><w:t xml:space="preserve">4 operasi pokok data: Create (Tambah), Read (Lihat), Update (Edit), Delete (Hapus).</w:t></w:r></w:p></w:tc></w:tr><w:tr><w:trPr/><w:tc><w:tcPr><w:tcW w:w="3000" w:type="dxa"/><w:shd w:val="clear" w:fill="F8FAFC"/><w:noWrap/></w:tcPr><w:p><w:pPr/><w:r><w:rPr><w:b w:val="1"/><w:bCs w:val="1"/></w:rPr><w:t xml:space="preserve">Pagination</w:t></w:r></w:p></w:tc><w:tc><w:tcPr><w:tcW w:w="7000" w:type="dxa"/><w:shd w:val="clear" w:fill="F8FAFC"/><w:noWrap/></w:tcPr><w:p><w:pPr/><w:r><w:rPr/><w:t xml:space="preserve">Pembagian data per lembar (misal 15 per halaman) agar website tidak lemot.</w:t></w:r></w:p></w:tc></w:tr><w:tr><w:trPr/><w:tc><w:tcPr><w:tcW w:w="3000" w:type="dxa"/><w:noWrap/></w:tcPr><w:p><w:pPr/><w:r><w:rPr><w:b w:val="1"/><w:bCs w:val="1"/></w:rPr><w:t xml:space="preserve">State (useState)</w:t></w:r></w:p></w:tc><w:tc><w:tcPr><w:tcW w:w="7000" w:type="dxa"/><w:noWrap/></w:tcPr><w:p><w:pPr/><w:r><w:rPr/><w:t xml:space="preserve">Ingatan jangka pendek komponen di browser yang membuat layar reaktif seketika.</w:t></w:r></w:p></w:tc></w:tr><w:tr><w:trPr/><w:tc><w:tcPr><w:tcW w:w="3000" w:type="dxa"/><w:shd w:val="clear" w:fill="F8FAFC"/><w:noWrap/></w:tcPr><w:p><w:pPr/><w:r><w:rPr><w:b w:val="1"/><w:bCs w:val="1"/></w:rPr><w:t xml:space="preserve">Defense in Depth</w:t></w:r></w:p></w:tc><w:tc><w:tcPr><w:tcW w:w="7000" w:type="dxa"/><w:shd w:val="clear" w:fill="F8FAFC"/><w:noWrap/></w:tcPr><w:p><w:pPr/><w:r><w:rPr/><w:t xml:space="preserve">Keamanan siber berlapis di sisi antarmuka browser dan benteng server backend.</w:t></w:r></w:p></w:tc></w:tr><w:tr><w:trPr/><w:tc><w:tcPr><w:tcW w:w="3000" w:type="dxa"/><w:noWrap/></w:tcPr><w:p><w:pPr/><w:r><w:rPr><w:b w:val="1"/><w:bCs w:val="1"/></w:rPr><w:t xml:space="preserve">Multi-Tenancy</w:t></w:r></w:p></w:tc><w:tc><w:tcPr><w:tcW w:w="7000" w:type="dxa"/><w:noWrap/></w:tcPr><w:p><w:pPr/><w:r><w:rPr/><w:t xml:space="preserve">Arsitektur satu sistem yang melayani banyak sekolah tanpa saling bocor data.</w:t></w:r></w:p></w:tc></w:tr><w:tr><w:trPr/><w:tc><w:tcPr><w:tcW w:w="3000" w:type="dxa"/><w:shd w:val="clear" w:fill="F8FAFC"/><w:noWrap/></w:tcPr><w:p><w:pPr/><w:r><w:rPr><w:b w:val="1"/><w:bCs w:val="1"/></w:rPr><w:t xml:space="preserve">Activity Log</w:t></w:r></w:p></w:tc><w:tc><w:tcPr><w:tcW w:w="7000" w:type="dxa"/><w:shd w:val="clear" w:fill="F8FAFC"/><w:noWrap/></w:tcPr><w:p><w:pPr/><w:r><w:rPr/><w:t xml:space="preserve">Kotak hitam rekaman jejak audit yang mencatat siapa mengubah apa dan kapan.</w:t></w:r></w:p></w:tc></w:tr></w:tbl><w:p/><w:p/><w:p><w:pPr><w:jc w:val="center"/></w:pPr><w:r><w:rPr><w:color w:val="065F46"/><w:b w:val="1"/><w:bCs w:val="1"/></w:rPr><w:t xml:space="preserve">Selamat! Anda telah menguasai fondasi arsitektur Fullstack Developer profesional secara komprehensif.</w:t></w:r></w:p><w:p><w:pPr><w:jc w:val="center"/></w:pPr><w:r><w:rPr><w:color w:val="94A3B8"/><w:i w:val="1"/><w:iCs w:val="1"/></w:rPr><w:t xml:space="preserve">Lembaga Pendidikan Ma'arif NU Cilacap &bull; 2026</w:t></w:r></w:p><w:sectPr><w:pgSz w:orient="portrait" w:w="11905.511811023622" w:h="16837.79527559055"/><w:pgMar w:top="1200" w:right="1200" w:bottom="1200" w:left="1200" w:header="720" w:footer="720" w:gutter="0"/><w:cols w:num="1" w:space="720"/></w:sectPr></w:body></w:document>
 </file>
 
 <file path=word/comments.xml><?xml version="1.0" encoding="utf-8"?>
@@ -55,8 +9,8 @@
 
 <file path=word/numbering.xml><?xml version="1.0" encoding="utf-8"?>
 <w:numbering xmlns:ve="http://schemas.openxmlformats.org/markup-compatibility/2006" xmlns:o="urn:schemas-microsoft-com:office:office" xmlns:r="http://schemas.openxmlformats.org/officeDocument/2006/relationships" xmlns:m="http://schemas.openxmlformats.org/officeDocument/2006/math" xmlns:v="urn:schemas-microsoft-com:vml" xmlns:wp="http://schemas.openxmlformats.org/drawingml/2006/wordprocessingDrawing" xmlns:w10="urn:schemas-microsoft-com:office:word" xmlns:w="http://schemas.openxmlformats.org/wordprocessingml/2006/main" xmlns:wne="http://schemas.microsoft.com/office/word/2006/wordml">
-  <w:abstractNum w:abstractNumId="4">
-    <w:nsid w:val="E467782B"/>
+  <w:abstractNum w:abstractNumId="3">
+    <w:nsid w:val="A870035B"/>
     <w:multiLevelType w:val="hybridMultilevel"/>
     <w:lvl w:ilvl="0">
       <w:start w:val="1"/>
@@ -203,8 +157,8 @@
       </w:rPr>
     </w:lvl>
   </w:abstractNum>
-  <w:num w:numId="4">
-    <w:abstractNumId w:val="4"/>
+  <w:num w:numId="3">
+    <w:abstractNumId w:val="3"/>
   </w:num>
 </w:numbering>
 </file>
@@ -238,13 +192,13 @@
     <w:name w:val="heading 1"/>
     <w:basedOn w:val="Normal"/>
     <w:pPr>
-      <w:spacing w:before="240" w:after="120"/>
+      <w:spacing w:before="200" w:after="100"/>
     </w:pPr>
     <w:rPr>
       <w:rFonts w:ascii="Calibri" w:hAnsi="Calibri" w:eastAsia="Calibri" w:cs="Calibri"/>
       <w:color w:val="065F46"/>
-      <w:sz w:val="36"/>
-      <w:szCs w:val="36"/>
+      <w:sz w:val="34"/>
+      <w:szCs w:val="34"/>
       <w:b w:val="1"/>
       <w:bCs w:val="1"/>
     </w:rPr>
@@ -254,57 +208,19 @@
     <w:name w:val="heading 2"/>
     <w:basedOn w:val="Normal"/>
     <w:pPr>
-      <w:spacing w:before="180" w:after="80"/>
+      <w:spacing w:before="150" w:after="60"/>
     </w:pPr>
     <w:rPr>
       <w:rFonts w:ascii="Calibri" w:hAnsi="Calibri" w:eastAsia="Calibri" w:cs="Calibri"/>
       <w:color w:val="047857"/>
-      <w:sz w:val="28"/>
-      <w:szCs w:val="28"/>
+      <w:sz w:val="26"/>
+      <w:szCs w:val="26"/>
       <w:b w:val="1"/>
       <w:bCs w:val="1"/>
     </w:rPr>
   </w:style>
-  <w:style w:type="paragraph" w:styleId="Heading3">
-    <w:link w:val="Heading3Char"/>
-    <w:name w:val="heading 3"/>
-    <w:basedOn w:val="Normal"/>
-    <w:pPr>
-      <w:spacing w:before="120" w:after="60"/>
-    </w:pPr>
-    <w:rPr>
-      <w:rFonts w:ascii="Calibri" w:hAnsi="Calibri" w:eastAsia="Calibri" w:cs="Calibri"/>
-      <w:color w:val="0F766E"/>
-      <w:sz w:val="24"/>
-      <w:szCs w:val="24"/>
-      <w:b w:val="1"/>
-      <w:bCs w:val="1"/>
-    </w:rPr>
-  </w:style>
-  <w:style w:type="table" w:customStyle="1" w:styleId="TableBakuBebas">
-    <w:name w:val="TableBakuBebas"/>
-    <w:uiPriority w:val="99"/>
-    <w:tblPr>
-      <w:tblW w:w="0" w:type="auto"/>
-      <w:tblLayout w:type="autofit"/>
-      <w:tblCellMar>
-        <w:top w:w="80" w:type="dxa"/>
-        <w:left w:w="80" w:type="dxa"/>
-        <w:right w:w="80" w:type="dxa"/>
-        <w:bottom w:w="80" w:type="dxa"/>
-      </w:tblCellMar>
-      <w:tblBorders>
-        <w:top w:val="single" w:sz="6" w:color="CBD5E1"/>
-        <w:left w:val="single" w:sz="6" w:color="CBD5E1"/>
-        <w:right w:val="single" w:sz="6" w:color="CBD5E1"/>
-        <w:bottom w:val="single" w:sz="6" w:color="CBD5E1"/>
-        <w:insideH w:val="single" w:sz="6" w:color="CBD5E1"/>
-        <w:insideV w:val="single" w:sz="6" w:color="CBD5E1"/>
-      </w:tblBorders>
-    </w:tblPr>
-  </w:style>
-  <w:style w:type="table" w:customStyle="1" w:styleId="TableGlosarium">
-    <w:name w:val="TableGlosarium"/>
+  <w:style w:type="table" w:customStyle="1" w:styleId="TableGlosariumV2">
+    <w:name w:val="TableGlosariumV2"/>
     <w:uiPriority w:val="99"/>
     <w:tblPr>
       <w:tblW w:w="0" w:type="auto"/>

</xml_diff>